<commit_message>
Adicionar campo de foto 3x4 sem óculos para identificação facial do membro
</commit_message>
<xml_diff>
--- a/Arquivos/O aplicativo_procedimentos traduzir.docx
+++ b/Arquivos/O aplicativo_procedimentos traduzir.docx
@@ -33,7 +33,7 @@
     <w:p>
       <w:r>
         <w:pict w14:anchorId="67B82DA5">
-          <v:rect id="_x0000_i1085" style="width:387.3pt;height:.75pt" o:hrpct="0" o:hralign="center" o:hrstd="t" o:hr="t" fillcolor="#a0a0a0" stroked="f"/>
+          <v:rect id="_x0000_i1025" style="width:387.3pt;height:.75pt" o:hrpct="0" o:hralign="center" o:hrstd="t" o:hr="t" fillcolor="#a0a0a0" stroked="f"/>
         </w:pict>
       </w:r>
     </w:p>
@@ -286,7 +286,7 @@
     <w:p>
       <w:r>
         <w:pict w14:anchorId="02ACC5DC">
-          <v:rect id="_x0000_i1091" style="width:387.3pt;height:.75pt" o:hrpct="0" o:hralign="center" o:hrstd="t" o:hr="t" fillcolor="#a0a0a0" stroked="f"/>
+          <v:rect id="_x0000_i1026" style="width:387.3pt;height:.75pt" o:hrpct="0" o:hralign="center" o:hrstd="t" o:hr="t" fillcolor="#a0a0a0" stroked="f"/>
         </w:pict>
       </w:r>
     </w:p>
@@ -468,7 +468,7 @@
     <w:p>
       <w:r>
         <w:pict w14:anchorId="392F392D">
-          <v:rect id="_x0000_i1092" style="width:387.3pt;height:.75pt" o:hrpct="0" o:hralign="center" o:hrstd="t" o:hr="t" fillcolor="#a0a0a0" stroked="f"/>
+          <v:rect id="_x0000_i1027" style="width:387.3pt;height:.75pt" o:hrpct="0" o:hralign="center" o:hrstd="t" o:hr="t" fillcolor="#a0a0a0" stroked="f"/>
         </w:pict>
       </w:r>
     </w:p>
@@ -962,7 +962,7 @@
     <w:p>
       <w:r>
         <w:pict w14:anchorId="23C894AB">
-          <v:rect id="_x0000_i1094" style="width:387.3pt;height:.75pt" o:hrpct="0" o:hralign="center" o:hrstd="t" o:hr="t" fillcolor="#a0a0a0" stroked="f"/>
+          <v:rect id="_x0000_i1028" style="width:387.3pt;height:.75pt" o:hrpct="0" o:hralign="center" o:hrstd="t" o:hr="t" fillcolor="#a0a0a0" stroked="f"/>
         </w:pict>
       </w:r>
     </w:p>
@@ -1013,7 +1013,7 @@
     <w:p>
       <w:r>
         <w:pict w14:anchorId="60FC192B">
-          <v:rect id="_x0000_i1095" style="width:387.3pt;height:.75pt" o:hrpct="0" o:hralign="center" o:hrstd="t" o:hr="t" fillcolor="#a0a0a0" stroked="f"/>
+          <v:rect id="_x0000_i1029" style="width:387.3pt;height:.75pt" o:hrpct="0" o:hralign="center" o:hrstd="t" o:hr="t" fillcolor="#a0a0a0" stroked="f"/>
         </w:pict>
       </w:r>
     </w:p>
@@ -1082,6 +1082,85 @@
         <w:t>.</w:t>
       </w:r>
     </w:p>
+    <w:p/>
+    <w:p>
+      <w:pPr>
+        <w:numPr>
+          <w:ilvl w:val="0"/>
+          <w:numId w:val="4"/>
+        </w:numPr>
+      </w:pPr>
+      <w:r>
+        <w:rPr>
+          <w:b/>
+          <w:bCs/>
+        </w:rPr>
+        <w:t xml:space="preserve">Usuário Administrador Geral </w:t>
+      </w:r>
+      <w:proofErr w:type="spellStart"/>
+      <w:r>
+        <w:rPr>
+          <w:b/>
+          <w:bCs/>
+        </w:rPr>
+        <w:t>Pré</w:t>
+      </w:r>
+      <w:proofErr w:type="spellEnd"/>
+      <w:r>
+        <w:rPr>
+          <w:b/>
+          <w:bCs/>
+        </w:rPr>
+        <w:t>-Configurado</w:t>
+      </w:r>
+      <w:r>
+        <w:t>:</w:t>
+      </w:r>
+    </w:p>
+    <w:p>
+      <w:pPr>
+        <w:numPr>
+          <w:ilvl w:val="1"/>
+          <w:numId w:val="4"/>
+        </w:numPr>
+      </w:pPr>
+      <w:r>
+        <w:rPr>
+          <w:b/>
+          <w:bCs/>
+        </w:rPr>
+        <w:t>E-mail:</w:t>
+      </w:r>
+      <w:r>
+        <w:t> admin@mevamgyn.com</w:t>
+      </w:r>
+    </w:p>
+    <w:p>
+      <w:pPr>
+        <w:numPr>
+          <w:ilvl w:val="1"/>
+          <w:numId w:val="4"/>
+        </w:numPr>
+      </w:pPr>
+      <w:r>
+        <w:rPr>
+          <w:b/>
+          <w:bCs/>
+        </w:rPr>
+        <w:t>Senha inicial:</w:t>
+      </w:r>
+      <w:r>
+        <w:t> Mevam@2026 </w:t>
+      </w:r>
+      <w:r>
+        <w:rPr>
+          <w:i/>
+          <w:iCs/>
+        </w:rPr>
+        <w:t>(Você pode alterar a senha ou cadastrar seu e-mail pessoal como Administrador a qualquer momento no painel).</w:t>
+      </w:r>
+    </w:p>
+    <w:p/>
     <w:p/>
     <w:sectPr>
       <w:pgSz w:w="11906" w:h="16838"/>
@@ -1446,6 +1525,155 @@
       </w:pPr>
     </w:lvl>
   </w:abstractNum>
+  <w:abstractNum w:abstractNumId="3" w15:restartNumberingAfterBreak="0">
+    <w:nsid w:val="7E8F138B"/>
+    <w:multiLevelType w:val="multilevel"/>
+    <w:tmpl w:val="EF529C66"/>
+    <w:lvl w:ilvl="0">
+      <w:start w:val="1"/>
+      <w:numFmt w:val="bullet"/>
+      <w:lvlText w:val=""/>
+      <w:lvlJc w:val="left"/>
+      <w:pPr>
+        <w:tabs>
+          <w:tab w:val="num" w:pos="720"/>
+        </w:tabs>
+        <w:ind w:left="720" w:hanging="360"/>
+      </w:pPr>
+      <w:rPr>
+        <w:rFonts w:ascii="Symbol" w:hAnsi="Symbol" w:hint="default"/>
+        <w:sz w:val="20"/>
+      </w:rPr>
+    </w:lvl>
+    <w:lvl w:ilvl="1">
+      <w:start w:val="1"/>
+      <w:numFmt w:val="bullet"/>
+      <w:lvlText w:val=""/>
+      <w:lvlJc w:val="left"/>
+      <w:pPr>
+        <w:tabs>
+          <w:tab w:val="num" w:pos="1440"/>
+        </w:tabs>
+        <w:ind w:left="1440" w:hanging="360"/>
+      </w:pPr>
+      <w:rPr>
+        <w:rFonts w:ascii="Symbol" w:hAnsi="Symbol" w:hint="default"/>
+        <w:sz w:val="20"/>
+      </w:rPr>
+    </w:lvl>
+    <w:lvl w:ilvl="2" w:tentative="1">
+      <w:start w:val="1"/>
+      <w:numFmt w:val="bullet"/>
+      <w:lvlText w:val=""/>
+      <w:lvlJc w:val="left"/>
+      <w:pPr>
+        <w:tabs>
+          <w:tab w:val="num" w:pos="2160"/>
+        </w:tabs>
+        <w:ind w:left="2160" w:hanging="360"/>
+      </w:pPr>
+      <w:rPr>
+        <w:rFonts w:ascii="Symbol" w:hAnsi="Symbol" w:hint="default"/>
+        <w:sz w:val="20"/>
+      </w:rPr>
+    </w:lvl>
+    <w:lvl w:ilvl="3" w:tentative="1">
+      <w:start w:val="1"/>
+      <w:numFmt w:val="bullet"/>
+      <w:lvlText w:val=""/>
+      <w:lvlJc w:val="left"/>
+      <w:pPr>
+        <w:tabs>
+          <w:tab w:val="num" w:pos="2880"/>
+        </w:tabs>
+        <w:ind w:left="2880" w:hanging="360"/>
+      </w:pPr>
+      <w:rPr>
+        <w:rFonts w:ascii="Symbol" w:hAnsi="Symbol" w:hint="default"/>
+        <w:sz w:val="20"/>
+      </w:rPr>
+    </w:lvl>
+    <w:lvl w:ilvl="4" w:tentative="1">
+      <w:start w:val="1"/>
+      <w:numFmt w:val="bullet"/>
+      <w:lvlText w:val=""/>
+      <w:lvlJc w:val="left"/>
+      <w:pPr>
+        <w:tabs>
+          <w:tab w:val="num" w:pos="3600"/>
+        </w:tabs>
+        <w:ind w:left="3600" w:hanging="360"/>
+      </w:pPr>
+      <w:rPr>
+        <w:rFonts w:ascii="Symbol" w:hAnsi="Symbol" w:hint="default"/>
+        <w:sz w:val="20"/>
+      </w:rPr>
+    </w:lvl>
+    <w:lvl w:ilvl="5" w:tentative="1">
+      <w:start w:val="1"/>
+      <w:numFmt w:val="bullet"/>
+      <w:lvlText w:val=""/>
+      <w:lvlJc w:val="left"/>
+      <w:pPr>
+        <w:tabs>
+          <w:tab w:val="num" w:pos="4320"/>
+        </w:tabs>
+        <w:ind w:left="4320" w:hanging="360"/>
+      </w:pPr>
+      <w:rPr>
+        <w:rFonts w:ascii="Symbol" w:hAnsi="Symbol" w:hint="default"/>
+        <w:sz w:val="20"/>
+      </w:rPr>
+    </w:lvl>
+    <w:lvl w:ilvl="6" w:tentative="1">
+      <w:start w:val="1"/>
+      <w:numFmt w:val="bullet"/>
+      <w:lvlText w:val=""/>
+      <w:lvlJc w:val="left"/>
+      <w:pPr>
+        <w:tabs>
+          <w:tab w:val="num" w:pos="5040"/>
+        </w:tabs>
+        <w:ind w:left="5040" w:hanging="360"/>
+      </w:pPr>
+      <w:rPr>
+        <w:rFonts w:ascii="Symbol" w:hAnsi="Symbol" w:hint="default"/>
+        <w:sz w:val="20"/>
+      </w:rPr>
+    </w:lvl>
+    <w:lvl w:ilvl="7" w:tentative="1">
+      <w:start w:val="1"/>
+      <w:numFmt w:val="bullet"/>
+      <w:lvlText w:val=""/>
+      <w:lvlJc w:val="left"/>
+      <w:pPr>
+        <w:tabs>
+          <w:tab w:val="num" w:pos="5760"/>
+        </w:tabs>
+        <w:ind w:left="5760" w:hanging="360"/>
+      </w:pPr>
+      <w:rPr>
+        <w:rFonts w:ascii="Symbol" w:hAnsi="Symbol" w:hint="default"/>
+        <w:sz w:val="20"/>
+      </w:rPr>
+    </w:lvl>
+    <w:lvl w:ilvl="8" w:tentative="1">
+      <w:start w:val="1"/>
+      <w:numFmt w:val="bullet"/>
+      <w:lvlText w:val=""/>
+      <w:lvlJc w:val="left"/>
+      <w:pPr>
+        <w:tabs>
+          <w:tab w:val="num" w:pos="6480"/>
+        </w:tabs>
+        <w:ind w:left="6480" w:hanging="360"/>
+      </w:pPr>
+      <w:rPr>
+        <w:rFonts w:ascii="Symbol" w:hAnsi="Symbol" w:hint="default"/>
+        <w:sz w:val="20"/>
+      </w:rPr>
+    </w:lvl>
+  </w:abstractNum>
   <w:num w:numId="1" w16cid:durableId="1642347392">
     <w:abstractNumId w:val="0"/>
   </w:num>
@@ -1454,6 +1682,9 @@
   </w:num>
   <w:num w:numId="3" w16cid:durableId="147328459">
     <w:abstractNumId w:val="1"/>
+  </w:num>
+  <w:num w:numId="4" w16cid:durableId="810487220">
+    <w:abstractNumId w:val="3"/>
   </w:num>
 </w:numbering>
 </file>

</xml_diff>